<commit_message>
update line type values mapping
</commit_message>
<xml_diff>
--- a/src/templates/template_Purchase_Invoice_BACS.docx
+++ b/src/templates/template_Purchase_Invoice_BACS.docx
@@ -2391,6 +2391,25 @@
               </w:rPr>
               <w:t>{</w:t>
             </w:r>
+            <w:r>
+              <w:rPr>
+                <w:rFonts w:ascii="Courier New" w:hAnsi="Courier New" w:cs="Courier New"/>
+                <w:sz w:val="20"/>
+                <w:szCs w:val="20"/>
+                <w:lang w:val="en-US"/>
+              </w:rPr>
+              <w:t>Invoice_Line__</w:t>
+            </w:r>
+            <w:proofErr w:type="gramStart"/>
+            <w:r>
+              <w:rPr>
+                <w:rFonts w:ascii="Courier New" w:hAnsi="Courier New" w:cs="Courier New"/>
+                <w:sz w:val="20"/>
+                <w:szCs w:val="20"/>
+                <w:lang w:val="en-US"/>
+              </w:rPr>
+              <w:t>c.</w:t>
+            </w:r>
             <w:proofErr w:type="spellStart"/>
             <w:r>
               <w:rPr>
@@ -2399,18 +2418,9 @@
                 <w:szCs w:val="20"/>
                 <w:lang w:val="en-US"/>
               </w:rPr>
-              <w:t>Invoice_Line__</w:t>
-            </w:r>
-            <w:proofErr w:type="gramStart"/>
-            <w:r>
-              <w:rPr>
-                <w:rFonts w:ascii="Courier New" w:hAnsi="Courier New" w:cs="Courier New"/>
-                <w:sz w:val="20"/>
-                <w:szCs w:val="20"/>
-                <w:lang w:val="en-US"/>
-              </w:rPr>
-              <w:t>c.Movement</w:t>
-            </w:r>
+              <w:t>WTNo</w:t>
+            </w:r>
+            <w:proofErr w:type="spellEnd"/>
             <w:proofErr w:type="gramEnd"/>
             <w:r>
               <w:rPr>
@@ -2419,9 +2429,8 @@
                 <w:szCs w:val="20"/>
                 <w:lang w:val="en-US"/>
               </w:rPr>
-              <w:t>__c.W_T_No__c</w:t>
-            </w:r>
-            <w:proofErr w:type="spellEnd"/>
+              <w:t>__c</w:t>
+            </w:r>
             <w:r>
               <w:rPr>
                 <w:rFonts w:ascii="Courier New" w:hAnsi="Courier New" w:cs="Courier New"/>
@@ -3222,8 +3231,8 @@
     </w:p>
     <w:tbl>
       <w:tblPr>
-        <w:tblW w:w="5277" w:type="dxa"/>
-        <w:tblInd w:w="5518" w:type="dxa"/>
+        <w:tblW w:w="5580" w:type="dxa"/>
+        <w:tblInd w:w="5215" w:type="dxa"/>
         <w:tblBorders>
           <w:top w:val="single" w:sz="4" w:space="0" w:color="auto"/>
           <w:left w:val="single" w:sz="4" w:space="0" w:color="auto"/>
@@ -3236,15 +3245,15 @@
         <w:tblLook w:val="01E0" w:firstRow="1" w:lastRow="1" w:firstColumn="1" w:lastColumn="1" w:noHBand="0" w:noVBand="0"/>
       </w:tblPr>
       <w:tblGrid>
-        <w:gridCol w:w="2217"/>
-        <w:gridCol w:w="1079"/>
-        <w:gridCol w:w="990"/>
-        <w:gridCol w:w="991"/>
+        <w:gridCol w:w="2160"/>
+        <w:gridCol w:w="1260"/>
+        <w:gridCol w:w="1080"/>
+        <w:gridCol w:w="1080"/>
       </w:tblGrid>
       <w:tr>
         <w:tc>
           <w:tcPr>
-            <w:tcW w:w="2217" w:type="dxa"/>
+            <w:tcW w:w="2160" w:type="dxa"/>
           </w:tcPr>
           <w:p>
             <w:pPr>
@@ -3270,7 +3279,7 @@
         </w:tc>
         <w:tc>
           <w:tcPr>
-            <w:tcW w:w="1079" w:type="dxa"/>
+            <w:tcW w:w="1260" w:type="dxa"/>
           </w:tcPr>
           <w:p>
             <w:pPr>
@@ -3290,39 +3299,19 @@
                 <w:rFonts w:ascii="Courier New" w:hAnsi="Courier New" w:cs="Courier New"/>
                 <w:sz w:val="20"/>
                 <w:szCs w:val="20"/>
-                <w:lang w:val="en-US"/>
-              </w:rPr>
-              <w:t>{Invoice_Line__</w:t>
-            </w:r>
-            <w:proofErr w:type="gramStart"/>
-            <w:r>
-              <w:rPr>
-                <w:rFonts w:ascii="Courier New" w:hAnsi="Courier New" w:cs="Courier New"/>
-                <w:sz w:val="20"/>
-                <w:szCs w:val="20"/>
-                <w:lang w:val="en-US"/>
-              </w:rPr>
-              <w:t>c.Unit</w:t>
-            </w:r>
-            <w:proofErr w:type="gramEnd"/>
-            <w:r>
-              <w:rPr>
-                <w:rFonts w:ascii="Courier New" w:hAnsi="Courier New" w:cs="Courier New"/>
-                <w:sz w:val="20"/>
-                <w:szCs w:val="20"/>
-                <w:lang w:val="en-US"/>
-              </w:rPr>
-              <w:t>_Price__c</w:t>
-            </w:r>
-            <w:r>
-              <w:rPr>
-                <w:rFonts w:ascii="Courier New" w:hAnsi="Courier New" w:cs="Courier New"/>
-                <w:sz w:val="20"/>
-                <w:szCs w:val="20"/>
-                <w:lang w:val="en-US"/>
-              </w:rPr>
-              <w:t>_1</w:t>
-            </w:r>
+              </w:rPr>
+              <w:t>{</w:t>
+            </w:r>
+            <w:proofErr w:type="spellStart"/>
+            <w:r>
+              <w:rPr>
+                <w:rFonts w:ascii="Courier New" w:hAnsi="Courier New" w:cs="Courier New"/>
+                <w:sz w:val="20"/>
+                <w:szCs w:val="20"/>
+              </w:rPr>
+              <w:t>invoice_line_type_h_g_c_a_levy_unit_price_sum</w:t>
+            </w:r>
+            <w:proofErr w:type="spellEnd"/>
             <w:r>
               <w:rPr>
                 <w:rFonts w:ascii="Courier New" w:hAnsi="Courier New" w:cs="Courier New"/>
@@ -3336,7 +3325,7 @@
         </w:tc>
         <w:tc>
           <w:tcPr>
-            <w:tcW w:w="990" w:type="dxa"/>
+            <w:tcW w:w="1080" w:type="dxa"/>
           </w:tcPr>
           <w:p>
             <w:pPr>
@@ -3358,33 +3347,32 @@
                 <w:szCs w:val="20"/>
                 <w:lang w:val="en-US"/>
               </w:rPr>
-              <w:t>{Invoice_Line__</w:t>
-            </w:r>
-            <w:proofErr w:type="gramStart"/>
-            <w:r>
-              <w:rPr>
-                <w:rFonts w:ascii="Courier New" w:hAnsi="Courier New" w:cs="Courier New"/>
-                <w:sz w:val="20"/>
-                <w:szCs w:val="20"/>
-                <w:lang w:val="en-US"/>
-              </w:rPr>
-              <w:t>c.Unit</w:t>
-            </w:r>
-            <w:proofErr w:type="gramEnd"/>
-            <w:r>
-              <w:rPr>
-                <w:rFonts w:ascii="Courier New" w:hAnsi="Courier New" w:cs="Courier New"/>
-                <w:sz w:val="20"/>
-                <w:szCs w:val="20"/>
-                <w:lang w:val="en-US"/>
-              </w:rPr>
-              <w:t>_Price__c_2}</w:t>
+              <w:t>{</w:t>
+            </w:r>
+            <w:proofErr w:type="spellStart"/>
+            <w:r>
+              <w:rPr>
+                <w:rFonts w:ascii="Courier New" w:hAnsi="Courier New" w:cs="Courier New"/>
+                <w:sz w:val="20"/>
+                <w:szCs w:val="20"/>
+              </w:rPr>
+              <w:t>invoice_line_type_h_g_c_a_levy_amount_sum</w:t>
+            </w:r>
+            <w:proofErr w:type="spellEnd"/>
+            <w:r>
+              <w:rPr>
+                <w:rFonts w:ascii="Courier New" w:hAnsi="Courier New" w:cs="Courier New"/>
+                <w:sz w:val="20"/>
+                <w:szCs w:val="20"/>
+                <w:lang w:val="en-US"/>
+              </w:rPr>
+              <w:t>}</w:t>
             </w:r>
           </w:p>
         </w:tc>
         <w:tc>
           <w:tcPr>
-            <w:tcW w:w="991" w:type="dxa"/>
+            <w:tcW w:w="1080" w:type="dxa"/>
           </w:tcPr>
           <w:p>
             <w:pPr>
@@ -3403,29 +3391,26 @@
                 <w:rFonts w:ascii="Courier New" w:hAnsi="Courier New" w:cs="Courier New"/>
                 <w:sz w:val="20"/>
                 <w:szCs w:val="20"/>
-                <w:lang w:val="en-US"/>
-              </w:rPr>
-              <w:t>{Invoice_Line__</w:t>
-            </w:r>
-            <w:proofErr w:type="gramStart"/>
-            <w:r>
-              <w:rPr>
-                <w:rFonts w:ascii="Courier New" w:hAnsi="Courier New" w:cs="Courier New"/>
-                <w:sz w:val="20"/>
-                <w:szCs w:val="20"/>
-                <w:lang w:val="en-US"/>
-              </w:rPr>
-              <w:t>c.Unit</w:t>
-            </w:r>
-            <w:proofErr w:type="gramEnd"/>
-            <w:r>
-              <w:rPr>
-                <w:rFonts w:ascii="Courier New" w:hAnsi="Courier New" w:cs="Courier New"/>
-                <w:sz w:val="20"/>
-                <w:szCs w:val="20"/>
-                <w:lang w:val="en-US"/>
-              </w:rPr>
-              <w:t>_Price__c_3}</w:t>
+              </w:rPr>
+              <w:t>{</w:t>
+            </w:r>
+            <w:proofErr w:type="spellStart"/>
+            <w:r>
+              <w:rPr>
+                <w:rFonts w:ascii="Courier New" w:hAnsi="Courier New" w:cs="Courier New"/>
+                <w:sz w:val="20"/>
+                <w:szCs w:val="20"/>
+              </w:rPr>
+              <w:t>invoice_line_type_h_g_c_a_levy_vat_sum</w:t>
+            </w:r>
+            <w:proofErr w:type="spellEnd"/>
+            <w:r>
+              <w:rPr>
+                <w:rFonts w:ascii="Courier New" w:hAnsi="Courier New" w:cs="Courier New"/>
+                <w:sz w:val="20"/>
+                <w:szCs w:val="20"/>
+              </w:rPr>
+              <w:t>}</w:t>
             </w:r>
           </w:p>
         </w:tc>
@@ -3433,7 +3418,7 @@
       <w:tr>
         <w:tc>
           <w:tcPr>
-            <w:tcW w:w="2217" w:type="dxa"/>
+            <w:tcW w:w="2160" w:type="dxa"/>
           </w:tcPr>
           <w:p>
             <w:pPr>
@@ -3459,7 +3444,7 @@
         </w:tc>
         <w:tc>
           <w:tcPr>
-            <w:tcW w:w="1079" w:type="dxa"/>
+            <w:tcW w:w="1260" w:type="dxa"/>
           </w:tcPr>
           <w:p>
             <w:pPr>
@@ -3478,45 +3463,24 @@
                 <w:rFonts w:ascii="Courier New" w:hAnsi="Courier New" w:cs="Courier New"/>
                 <w:sz w:val="20"/>
                 <w:szCs w:val="20"/>
-                <w:lang w:val="en-US"/>
-              </w:rPr>
-              <w:t>{Invoice_Line__</w:t>
-            </w:r>
-            <w:proofErr w:type="gramStart"/>
-            <w:r>
-              <w:rPr>
-                <w:rFonts w:ascii="Courier New" w:hAnsi="Courier New" w:cs="Courier New"/>
-                <w:sz w:val="20"/>
-                <w:szCs w:val="20"/>
-                <w:lang w:val="en-US"/>
-              </w:rPr>
-              <w:t>c.Pre</w:t>
-            </w:r>
-            <w:proofErr w:type="gramEnd"/>
-            <w:r>
-              <w:rPr>
-                <w:rFonts w:ascii="Courier New" w:hAnsi="Courier New" w:cs="Courier New"/>
-                <w:sz w:val="20"/>
-                <w:szCs w:val="20"/>
-                <w:lang w:val="en-US"/>
-              </w:rPr>
-              <w:t>_VAT_Total__c</w:t>
-            </w:r>
-            <w:r>
-              <w:rPr>
-                <w:rFonts w:ascii="Courier New" w:hAnsi="Courier New" w:cs="Courier New"/>
-                <w:sz w:val="20"/>
-                <w:szCs w:val="20"/>
-                <w:lang w:val="en-US"/>
-              </w:rPr>
-              <w:t>_1</w:t>
-            </w:r>
-            <w:r>
-              <w:rPr>
-                <w:rFonts w:ascii="Courier New" w:hAnsi="Courier New" w:cs="Courier New"/>
-                <w:sz w:val="20"/>
-                <w:szCs w:val="20"/>
-                <w:lang w:val="en-US"/>
+              </w:rPr>
+              <w:t>{</w:t>
+            </w:r>
+            <w:proofErr w:type="spellStart"/>
+            <w:r>
+              <w:rPr>
+                <w:rFonts w:ascii="Courier New" w:hAnsi="Courier New" w:cs="Courier New"/>
+                <w:sz w:val="20"/>
+                <w:szCs w:val="20"/>
+              </w:rPr>
+              <w:t>invoice_line_type_credit_insurance_levy_unit_price_sum</w:t>
+            </w:r>
+            <w:proofErr w:type="spellEnd"/>
+            <w:r>
+              <w:rPr>
+                <w:rFonts w:ascii="Courier New" w:hAnsi="Courier New" w:cs="Courier New"/>
+                <w:sz w:val="20"/>
+                <w:szCs w:val="20"/>
               </w:rPr>
               <w:t>}</w:t>
             </w:r>
@@ -3524,7 +3488,7 @@
         </w:tc>
         <w:tc>
           <w:tcPr>
-            <w:tcW w:w="990" w:type="dxa"/>
+            <w:tcW w:w="1080" w:type="dxa"/>
           </w:tcPr>
           <w:p>
             <w:pPr>
@@ -3543,35 +3507,41 @@
                 <w:rFonts w:ascii="Courier New" w:hAnsi="Courier New" w:cs="Courier New"/>
                 <w:sz w:val="20"/>
                 <w:szCs w:val="20"/>
-                <w:lang w:val="en-US"/>
-              </w:rPr>
-              <w:t>{Invoice_Line__</w:t>
-            </w:r>
-            <w:proofErr w:type="gramStart"/>
-            <w:r>
-              <w:rPr>
-                <w:rFonts w:ascii="Courier New" w:hAnsi="Courier New" w:cs="Courier New"/>
-                <w:sz w:val="20"/>
-                <w:szCs w:val="20"/>
-                <w:lang w:val="en-US"/>
-              </w:rPr>
-              <w:t>c.Pre</w:t>
-            </w:r>
-            <w:proofErr w:type="gramEnd"/>
-            <w:r>
-              <w:rPr>
-                <w:rFonts w:ascii="Courier New" w:hAnsi="Courier New" w:cs="Courier New"/>
-                <w:sz w:val="20"/>
-                <w:szCs w:val="20"/>
-                <w:lang w:val="en-US"/>
-              </w:rPr>
-              <w:t>_VAT_Total__c_2}</w:t>
+              </w:rPr>
+              <w:t>{</w:t>
+            </w:r>
+            <w:proofErr w:type="spellStart"/>
+            <w:r>
+              <w:rPr>
+                <w:rFonts w:ascii="Courier New" w:hAnsi="Courier New" w:cs="Courier New"/>
+                <w:sz w:val="20"/>
+                <w:szCs w:val="20"/>
+              </w:rPr>
+              <w:t>invoice_line_type_credit_insurance_levy_amount_s</w:t>
+            </w:r>
+            <w:r>
+              <w:rPr>
+                <w:rFonts w:ascii="Courier New" w:hAnsi="Courier New" w:cs="Courier New"/>
+                <w:sz w:val="20"/>
+                <w:szCs w:val="20"/>
+              </w:rPr>
+              <w:lastRenderedPageBreak/>
+              <w:t>um</w:t>
+            </w:r>
+            <w:proofErr w:type="spellEnd"/>
+            <w:r>
+              <w:rPr>
+                <w:rFonts w:ascii="Courier New" w:hAnsi="Courier New" w:cs="Courier New"/>
+                <w:sz w:val="20"/>
+                <w:szCs w:val="20"/>
+              </w:rPr>
+              <w:t>}</w:t>
             </w:r>
           </w:p>
         </w:tc>
         <w:tc>
           <w:tcPr>
-            <w:tcW w:w="991" w:type="dxa"/>
+            <w:tcW w:w="1080" w:type="dxa"/>
           </w:tcPr>
           <w:p>
             <w:pPr>
@@ -3590,29 +3560,27 @@
                 <w:rFonts w:ascii="Courier New" w:hAnsi="Courier New" w:cs="Courier New"/>
                 <w:sz w:val="20"/>
                 <w:szCs w:val="20"/>
-                <w:lang w:val="en-US"/>
-              </w:rPr>
-              <w:t>{Invoice_Line__</w:t>
-            </w:r>
-            <w:proofErr w:type="gramStart"/>
-            <w:r>
-              <w:rPr>
-                <w:rFonts w:ascii="Courier New" w:hAnsi="Courier New" w:cs="Courier New"/>
-                <w:sz w:val="20"/>
-                <w:szCs w:val="20"/>
-                <w:lang w:val="en-US"/>
-              </w:rPr>
-              <w:t>c.Pre</w:t>
-            </w:r>
-            <w:proofErr w:type="gramEnd"/>
-            <w:r>
-              <w:rPr>
-                <w:rFonts w:ascii="Courier New" w:hAnsi="Courier New" w:cs="Courier New"/>
-                <w:sz w:val="20"/>
-                <w:szCs w:val="20"/>
-                <w:lang w:val="en-US"/>
-              </w:rPr>
-              <w:t>_VAT_Total__c_3}</w:t>
+              </w:rPr>
+              <w:lastRenderedPageBreak/>
+              <w:t>{</w:t>
+            </w:r>
+            <w:proofErr w:type="spellStart"/>
+            <w:r>
+              <w:rPr>
+                <w:rFonts w:ascii="Courier New" w:hAnsi="Courier New" w:cs="Courier New"/>
+                <w:sz w:val="20"/>
+                <w:szCs w:val="20"/>
+              </w:rPr>
+              <w:t>invoice_line_type_credit_insurance_levy_vat_sum</w:t>
+            </w:r>
+            <w:proofErr w:type="spellEnd"/>
+            <w:r>
+              <w:rPr>
+                <w:rFonts w:ascii="Courier New" w:hAnsi="Courier New" w:cs="Courier New"/>
+                <w:sz w:val="20"/>
+                <w:szCs w:val="20"/>
+              </w:rPr>
+              <w:t>}</w:t>
             </w:r>
           </w:p>
         </w:tc>
@@ -3620,7 +3588,7 @@
       <w:tr>
         <w:tc>
           <w:tcPr>
-            <w:tcW w:w="2217" w:type="dxa"/>
+            <w:tcW w:w="2160" w:type="dxa"/>
           </w:tcPr>
           <w:p>
             <w:pPr>
@@ -3646,7 +3614,7 @@
         </w:tc>
         <w:tc>
           <w:tcPr>
-            <w:tcW w:w="1079" w:type="dxa"/>
+            <w:tcW w:w="1260" w:type="dxa"/>
           </w:tcPr>
           <w:p>
             <w:pPr>
@@ -3665,35 +3633,24 @@
                 <w:rFonts w:ascii="Courier New" w:hAnsi="Courier New" w:cs="Courier New"/>
                 <w:sz w:val="20"/>
                 <w:szCs w:val="20"/>
-                <w:lang w:val="en-US"/>
-              </w:rPr>
-              <w:t>{Invoice_Line_</w:t>
-            </w:r>
-            <w:r>
-              <w:rPr>
-                <w:rFonts w:ascii="Courier New" w:hAnsi="Courier New" w:cs="Courier New"/>
-                <w:sz w:val="20"/>
-                <w:szCs w:val="20"/>
-                <w:lang w:val="en-US"/>
-              </w:rPr>
-              <w:lastRenderedPageBreak/>
-              <w:t>_c.VAT_Amount__c</w:t>
-            </w:r>
-            <w:r>
-              <w:rPr>
-                <w:rFonts w:ascii="Courier New" w:hAnsi="Courier New" w:cs="Courier New"/>
-                <w:sz w:val="20"/>
-                <w:szCs w:val="20"/>
-                <w:lang w:val="en-US"/>
-              </w:rPr>
-              <w:t>_1</w:t>
-            </w:r>
-            <w:r>
-              <w:rPr>
-                <w:rFonts w:ascii="Courier New" w:hAnsi="Courier New" w:cs="Courier New"/>
-                <w:sz w:val="20"/>
-                <w:szCs w:val="20"/>
-                <w:lang w:val="en-US"/>
+              </w:rPr>
+              <w:t>{</w:t>
+            </w:r>
+            <w:proofErr w:type="spellStart"/>
+            <w:r>
+              <w:rPr>
+                <w:rFonts w:ascii="Courier New" w:hAnsi="Courier New" w:cs="Courier New"/>
+                <w:sz w:val="20"/>
+                <w:szCs w:val="20"/>
+              </w:rPr>
+              <w:t>invoice_line_type_weighbridge_unit_price_sum</w:t>
+            </w:r>
+            <w:proofErr w:type="spellEnd"/>
+            <w:r>
+              <w:rPr>
+                <w:rFonts w:ascii="Courier New" w:hAnsi="Courier New" w:cs="Courier New"/>
+                <w:sz w:val="20"/>
+                <w:szCs w:val="20"/>
               </w:rPr>
               <w:t>}</w:t>
             </w:r>
@@ -3701,7 +3658,7 @@
         </w:tc>
         <w:tc>
           <w:tcPr>
-            <w:tcW w:w="990" w:type="dxa"/>
+            <w:tcW w:w="1080" w:type="dxa"/>
           </w:tcPr>
           <w:p>
             <w:pPr>
@@ -3720,26 +3677,32 @@
                 <w:rFonts w:ascii="Courier New" w:hAnsi="Courier New" w:cs="Courier New"/>
                 <w:sz w:val="20"/>
                 <w:szCs w:val="20"/>
-                <w:lang w:val="en-US"/>
-              </w:rPr>
-              <w:lastRenderedPageBreak/>
-              <w:t>{Invoice_Lin</w:t>
-            </w:r>
-            <w:r>
-              <w:rPr>
-                <w:rFonts w:ascii="Courier New" w:hAnsi="Courier New" w:cs="Courier New"/>
-                <w:sz w:val="20"/>
-                <w:szCs w:val="20"/>
-                <w:lang w:val="en-US"/>
-              </w:rPr>
-              <w:lastRenderedPageBreak/>
-              <w:t>e__c.VAT_Amount__c_2}</w:t>
+              </w:rPr>
+              <w:t>{</w:t>
+            </w:r>
+            <w:proofErr w:type="spellStart"/>
+            <w:r>
+              <w:rPr>
+                <w:rFonts w:ascii="Courier New" w:hAnsi="Courier New" w:cs="Courier New"/>
+                <w:sz w:val="20"/>
+                <w:szCs w:val="20"/>
+              </w:rPr>
+              <w:t>invoice_line_type_weighbridge_amount_sum</w:t>
+            </w:r>
+            <w:proofErr w:type="spellEnd"/>
+            <w:r>
+              <w:rPr>
+                <w:rFonts w:ascii="Courier New" w:hAnsi="Courier New" w:cs="Courier New"/>
+                <w:sz w:val="20"/>
+                <w:szCs w:val="20"/>
+              </w:rPr>
+              <w:t>}</w:t>
             </w:r>
           </w:p>
         </w:tc>
         <w:tc>
           <w:tcPr>
-            <w:tcW w:w="991" w:type="dxa"/>
+            <w:tcW w:w="1080" w:type="dxa"/>
           </w:tcPr>
           <w:p>
             <w:pPr>
@@ -3758,20 +3721,26 @@
                 <w:rFonts w:ascii="Courier New" w:hAnsi="Courier New" w:cs="Courier New"/>
                 <w:sz w:val="20"/>
                 <w:szCs w:val="20"/>
-                <w:lang w:val="en-US"/>
-              </w:rPr>
-              <w:lastRenderedPageBreak/>
-              <w:t>{Invoice_Lin</w:t>
-            </w:r>
-            <w:r>
-              <w:rPr>
-                <w:rFonts w:ascii="Courier New" w:hAnsi="Courier New" w:cs="Courier New"/>
-                <w:sz w:val="20"/>
-                <w:szCs w:val="20"/>
-                <w:lang w:val="en-US"/>
-              </w:rPr>
-              <w:lastRenderedPageBreak/>
-              <w:t>e__c.VAT_Amount__c_3}</w:t>
+              </w:rPr>
+              <w:t>{</w:t>
+            </w:r>
+            <w:proofErr w:type="spellStart"/>
+            <w:r>
+              <w:rPr>
+                <w:rFonts w:ascii="Courier New" w:hAnsi="Courier New" w:cs="Courier New"/>
+                <w:sz w:val="20"/>
+                <w:szCs w:val="20"/>
+              </w:rPr>
+              <w:t>invoice_line_type_weighbridge_vat_sum</w:t>
+            </w:r>
+            <w:proofErr w:type="spellEnd"/>
+            <w:r>
+              <w:rPr>
+                <w:rFonts w:ascii="Courier New" w:hAnsi="Courier New" w:cs="Courier New"/>
+                <w:sz w:val="20"/>
+                <w:szCs w:val="20"/>
+              </w:rPr>
+              <w:t>}</w:t>
             </w:r>
           </w:p>
         </w:tc>

</xml_diff>

<commit_message>
update invoice line mapping
</commit_message>
<xml_diff>
--- a/src/templates/template_Purchase_Invoice_BACS.docx
+++ b/src/templates/template_Purchase_Invoice_BACS.docx
@@ -3141,6 +3141,184 @@
                 <w:sz w:val="20"/>
                 <w:szCs w:val="20"/>
               </w:rPr>
+              <w:t>quality_adjustment_pre_vat_total</w:t>
+            </w:r>
+            <w:proofErr w:type="spellEnd"/>
+            <w:r>
+              <w:rPr>
+                <w:rFonts w:ascii="Courier New" w:hAnsi="Courier New" w:cs="Courier New"/>
+                <w:sz w:val="20"/>
+                <w:szCs w:val="20"/>
+                <w:lang w:val="en-US"/>
+              </w:rPr>
+              <w:t>}</w:t>
+            </w:r>
+          </w:p>
+        </w:tc>
+        <w:tc>
+          <w:tcPr>
+            <w:tcW w:w="1075" w:type="dxa"/>
+          </w:tcPr>
+          <w:p>
+            <w:pPr>
+              <w:widowControl w:val="0"/>
+              <w:autoSpaceDE w:val="0"/>
+              <w:autoSpaceDN w:val="0"/>
+              <w:adjustRightInd w:val="0"/>
+              <w:rPr>
+                <w:rFonts w:ascii="Courier New" w:hAnsi="Courier New" w:cs="Courier New"/>
+                <w:sz w:val="20"/>
+                <w:szCs w:val="20"/>
+                <w:lang w:val="en-US"/>
+              </w:rPr>
+            </w:pPr>
+          </w:p>
+        </w:tc>
+      </w:tr>
+      <w:tr>
+        <w:tc>
+          <w:tcPr>
+            <w:tcW w:w="1795" w:type="dxa"/>
+          </w:tcPr>
+          <w:p>
+            <w:pPr>
+              <w:widowControl w:val="0"/>
+              <w:autoSpaceDE w:val="0"/>
+              <w:autoSpaceDN w:val="0"/>
+              <w:adjustRightInd w:val="0"/>
+              <w:rPr>
+                <w:rFonts w:ascii="Courier New" w:hAnsi="Courier New" w:cs="Courier New"/>
+                <w:sz w:val="20"/>
+                <w:szCs w:val="20"/>
+                <w:lang w:val="en-US"/>
+              </w:rPr>
+            </w:pPr>
+          </w:p>
+        </w:tc>
+        <w:tc>
+          <w:tcPr>
+            <w:tcW w:w="990" w:type="dxa"/>
+          </w:tcPr>
+          <w:p>
+            <w:pPr>
+              <w:widowControl w:val="0"/>
+              <w:autoSpaceDE w:val="0"/>
+              <w:autoSpaceDN w:val="0"/>
+              <w:adjustRightInd w:val="0"/>
+              <w:rPr>
+                <w:rFonts w:ascii="Courier New" w:hAnsi="Courier New" w:cs="Courier New"/>
+                <w:sz w:val="20"/>
+                <w:szCs w:val="20"/>
+                <w:lang w:val="en-US"/>
+              </w:rPr>
+            </w:pPr>
+          </w:p>
+        </w:tc>
+        <w:tc>
+          <w:tcPr>
+            <w:tcW w:w="1080" w:type="dxa"/>
+          </w:tcPr>
+          <w:p>
+            <w:pPr>
+              <w:widowControl w:val="0"/>
+              <w:autoSpaceDE w:val="0"/>
+              <w:autoSpaceDN w:val="0"/>
+              <w:adjustRightInd w:val="0"/>
+              <w:rPr>
+                <w:rFonts w:ascii="Courier New" w:hAnsi="Courier New" w:cs="Courier New"/>
+                <w:sz w:val="20"/>
+                <w:szCs w:val="20"/>
+                <w:lang w:val="en-US"/>
+              </w:rPr>
+            </w:pPr>
+          </w:p>
+        </w:tc>
+        <w:tc>
+          <w:tcPr>
+            <w:tcW w:w="1535" w:type="dxa"/>
+          </w:tcPr>
+          <w:p>
+            <w:pPr>
+              <w:widowControl w:val="0"/>
+              <w:autoSpaceDE w:val="0"/>
+              <w:autoSpaceDN w:val="0"/>
+              <w:adjustRightInd w:val="0"/>
+              <w:rPr>
+                <w:rFonts w:ascii="Courier New" w:hAnsi="Courier New" w:cs="Courier New"/>
+                <w:sz w:val="20"/>
+                <w:szCs w:val="20"/>
+                <w:lang w:val="en-US"/>
+              </w:rPr>
+            </w:pPr>
+          </w:p>
+        </w:tc>
+        <w:tc>
+          <w:tcPr>
+            <w:tcW w:w="1980" w:type="dxa"/>
+          </w:tcPr>
+          <w:p>
+            <w:pPr>
+              <w:widowControl w:val="0"/>
+              <w:autoSpaceDE w:val="0"/>
+              <w:autoSpaceDN w:val="0"/>
+              <w:adjustRightInd w:val="0"/>
+              <w:rPr>
+                <w:rFonts w:ascii="Courier New" w:hAnsi="Courier New" w:cs="Courier New"/>
+                <w:sz w:val="20"/>
+                <w:szCs w:val="20"/>
+              </w:rPr>
+            </w:pPr>
+          </w:p>
+        </w:tc>
+        <w:tc>
+          <w:tcPr>
+            <w:tcW w:w="1260" w:type="dxa"/>
+          </w:tcPr>
+          <w:p>
+            <w:pPr>
+              <w:widowControl w:val="0"/>
+              <w:autoSpaceDE w:val="0"/>
+              <w:autoSpaceDN w:val="0"/>
+              <w:adjustRightInd w:val="0"/>
+              <w:rPr>
+                <w:rFonts w:ascii="Courier New" w:hAnsi="Courier New" w:cs="Courier New"/>
+                <w:sz w:val="20"/>
+                <w:szCs w:val="20"/>
+              </w:rPr>
+            </w:pPr>
+          </w:p>
+        </w:tc>
+        <w:tc>
+          <w:tcPr>
+            <w:tcW w:w="1080" w:type="dxa"/>
+          </w:tcPr>
+          <w:p>
+            <w:pPr>
+              <w:widowControl w:val="0"/>
+              <w:autoSpaceDE w:val="0"/>
+              <w:autoSpaceDN w:val="0"/>
+              <w:adjustRightInd w:val="0"/>
+              <w:rPr>
+                <w:rFonts w:ascii="Courier New" w:hAnsi="Courier New" w:cs="Courier New"/>
+                <w:sz w:val="20"/>
+                <w:szCs w:val="20"/>
+              </w:rPr>
+            </w:pPr>
+            <w:r>
+              <w:rPr>
+                <w:rFonts w:ascii="Courier New" w:hAnsi="Courier New" w:cs="Courier New"/>
+                <w:sz w:val="20"/>
+                <w:szCs w:val="20"/>
+              </w:rPr>
+              <w:t>{</w:t>
+            </w:r>
+            <w:proofErr w:type="spellStart"/>
+            <w:r>
+              <w:rPr>
+                <w:rFonts w:ascii="Courier New" w:hAnsi="Courier New" w:cs="Courier New"/>
+                <w:sz w:val="20"/>
+                <w:szCs w:val="20"/>
+              </w:rPr>
               <w:t>Invoice__</w:t>
             </w:r>
             <w:proofErr w:type="gramStart"/>
@@ -3473,51 +3651,7 @@
                 <w:sz w:val="20"/>
                 <w:szCs w:val="20"/>
               </w:rPr>
-              <w:t>invoice_line_type_credit_insurance_levy_unit_price_sum</w:t>
-            </w:r>
-            <w:proofErr w:type="spellEnd"/>
-            <w:r>
-              <w:rPr>
-                <w:rFonts w:ascii="Courier New" w:hAnsi="Courier New" w:cs="Courier New"/>
-                <w:sz w:val="20"/>
-                <w:szCs w:val="20"/>
-              </w:rPr>
-              <w:t>}</w:t>
-            </w:r>
-          </w:p>
-        </w:tc>
-        <w:tc>
-          <w:tcPr>
-            <w:tcW w:w="1080" w:type="dxa"/>
-          </w:tcPr>
-          <w:p>
-            <w:pPr>
-              <w:widowControl w:val="0"/>
-              <w:autoSpaceDE w:val="0"/>
-              <w:autoSpaceDN w:val="0"/>
-              <w:adjustRightInd w:val="0"/>
-              <w:rPr>
-                <w:rFonts w:ascii="Courier New" w:hAnsi="Courier New" w:cs="Courier New"/>
-                <w:sz w:val="20"/>
-                <w:szCs w:val="20"/>
-              </w:rPr>
-            </w:pPr>
-            <w:r>
-              <w:rPr>
-                <w:rFonts w:ascii="Courier New" w:hAnsi="Courier New" w:cs="Courier New"/>
-                <w:sz w:val="20"/>
-                <w:szCs w:val="20"/>
-              </w:rPr>
-              <w:t>{</w:t>
-            </w:r>
-            <w:proofErr w:type="spellStart"/>
-            <w:r>
-              <w:rPr>
-                <w:rFonts w:ascii="Courier New" w:hAnsi="Courier New" w:cs="Courier New"/>
-                <w:sz w:val="20"/>
-                <w:szCs w:val="20"/>
-              </w:rPr>
-              <w:t>invoice_line_type_credit_insurance_levy_amount_s</w:t>
+              <w:t>invoice_line_ty</w:t>
             </w:r>
             <w:r>
               <w:rPr>
@@ -3526,7 +3660,7 @@
                 <w:szCs w:val="20"/>
               </w:rPr>
               <w:lastRenderedPageBreak/>
-              <w:t>um</w:t>
+              <w:t>pe_credit_insurance_levy_unit_price_sum</w:t>
             </w:r>
             <w:proofErr w:type="spellEnd"/>
             <w:r>
@@ -3571,7 +3705,70 @@
                 <w:sz w:val="20"/>
                 <w:szCs w:val="20"/>
               </w:rPr>
-              <w:t>invoice_line_type_credit_insurance_levy_vat_sum</w:t>
+              <w:t>invoice_line_</w:t>
+            </w:r>
+            <w:r>
+              <w:rPr>
+                <w:rFonts w:ascii="Courier New" w:hAnsi="Courier New" w:cs="Courier New"/>
+                <w:sz w:val="20"/>
+                <w:szCs w:val="20"/>
+              </w:rPr>
+              <w:lastRenderedPageBreak/>
+              <w:t>type_credit_insurance_levy_amount_sum</w:t>
+            </w:r>
+            <w:proofErr w:type="spellEnd"/>
+            <w:r>
+              <w:rPr>
+                <w:rFonts w:ascii="Courier New" w:hAnsi="Courier New" w:cs="Courier New"/>
+                <w:sz w:val="20"/>
+                <w:szCs w:val="20"/>
+              </w:rPr>
+              <w:t>}</w:t>
+            </w:r>
+          </w:p>
+        </w:tc>
+        <w:tc>
+          <w:tcPr>
+            <w:tcW w:w="1080" w:type="dxa"/>
+          </w:tcPr>
+          <w:p>
+            <w:pPr>
+              <w:widowControl w:val="0"/>
+              <w:autoSpaceDE w:val="0"/>
+              <w:autoSpaceDN w:val="0"/>
+              <w:adjustRightInd w:val="0"/>
+              <w:rPr>
+                <w:rFonts w:ascii="Courier New" w:hAnsi="Courier New" w:cs="Courier New"/>
+                <w:sz w:val="20"/>
+                <w:szCs w:val="20"/>
+              </w:rPr>
+            </w:pPr>
+            <w:r>
+              <w:rPr>
+                <w:rFonts w:ascii="Courier New" w:hAnsi="Courier New" w:cs="Courier New"/>
+                <w:sz w:val="20"/>
+                <w:szCs w:val="20"/>
+              </w:rPr>
+              <w:lastRenderedPageBreak/>
+              <w:t>{</w:t>
+            </w:r>
+            <w:proofErr w:type="spellStart"/>
+            <w:r>
+              <w:rPr>
+                <w:rFonts w:ascii="Courier New" w:hAnsi="Courier New" w:cs="Courier New"/>
+                <w:sz w:val="20"/>
+                <w:szCs w:val="20"/>
+              </w:rPr>
+              <w:t>invoice_line_</w:t>
+            </w:r>
+            <w:r>
+              <w:rPr>
+                <w:rFonts w:ascii="Courier New" w:hAnsi="Courier New" w:cs="Courier New"/>
+                <w:sz w:val="20"/>
+                <w:szCs w:val="20"/>
+              </w:rPr>
+              <w:lastRenderedPageBreak/>
+              <w:t>type_credit_insurance_levy_vat_sum</w:t>
             </w:r>
             <w:proofErr w:type="spellEnd"/>
             <w:r>
@@ -5031,7 +5228,6 @@
   <w:style w:type="character" w:default="1" w:styleId="DefaultParagraphFont">
     <w:name w:val="Default Paragraph Font"/>
     <w:uiPriority w:val="1"/>
-    <w:semiHidden/>
     <w:unhideWhenUsed/>
   </w:style>
   <w:style w:type="table" w:default="1" w:styleId="TableNormal">

</xml_diff>